<commit_message>
Anti-collision v2: déplacements horizontaux, labels F4-F6 compacts (2 lignes), offsets élargis, 49 images régénérées + document complet
</commit_message>
<xml_diff>
--- a/Versions-html-and-docx/section_bois_v5.docx
+++ b/Versions-html-and-docx/section_bois_v5.docx
@@ -137,7 +137,7 @@
       <w:r>
         <w:drawing>
           <wp:inline xmlns:a="http://schemas.openxmlformats.org/drawingml/2006/main" xmlns:pic="http://schemas.openxmlformats.org/drawingml/2006/picture">
-            <wp:extent cx="5943600" cy="2948763"/>
+            <wp:extent cx="5943600" cy="2944613"/>
             <wp:docPr id="1" name="Picture 1"/>
             <wp:cNvGraphicFramePr>
               <a:graphicFrameLocks noChangeAspect="1"/>
@@ -158,7 +158,7 @@
                   <pic:spPr>
                     <a:xfrm>
                       <a:off x="0" y="0"/>
-                      <a:ext cx="5943600" cy="2948763"/>
+                      <a:ext cx="5943600" cy="2944613"/>
                     </a:xfrm>
                     <a:prstGeom prst="rect"/>
                   </pic:spPr>
@@ -16880,7 +16880,7 @@
       <w:r>
         <w:drawing>
           <wp:inline xmlns:a="http://schemas.openxmlformats.org/drawingml/2006/main" xmlns:pic="http://schemas.openxmlformats.org/drawingml/2006/picture">
-            <wp:extent cx="5943600" cy="2944613"/>
+            <wp:extent cx="5943600" cy="2948763"/>
             <wp:docPr id="6" name="Picture 6"/>
             <wp:cNvGraphicFramePr>
               <a:graphicFrameLocks noChangeAspect="1"/>
@@ -16901,7 +16901,7 @@
                   <pic:spPr>
                     <a:xfrm>
                       <a:off x="0" y="0"/>
-                      <a:ext cx="5943600" cy="2944613"/>
+                      <a:ext cx="5943600" cy="2948763"/>
                     </a:xfrm>
                     <a:prstGeom prst="rect"/>
                   </pic:spPr>
@@ -24985,7 +24985,7 @@
       <w:r>
         <w:drawing>
           <wp:inline xmlns:a="http://schemas.openxmlformats.org/drawingml/2006/main" xmlns:pic="http://schemas.openxmlformats.org/drawingml/2006/picture">
-            <wp:extent cx="5943600" cy="2938409"/>
+            <wp:extent cx="5943600" cy="2944613"/>
             <wp:docPr id="9" name="Picture 9"/>
             <wp:cNvGraphicFramePr>
               <a:graphicFrameLocks noChangeAspect="1"/>
@@ -25006,7 +25006,7 @@
                   <pic:spPr>
                     <a:xfrm>
                       <a:off x="0" y="0"/>
-                      <a:ext cx="5943600" cy="2938409"/>
+                      <a:ext cx="5943600" cy="2944613"/>
                     </a:xfrm>
                     <a:prstGeom prst="rect"/>
                   </pic:spPr>
@@ -31233,7 +31233,7 @@
       <w:r>
         <w:drawing>
           <wp:inline xmlns:a="http://schemas.openxmlformats.org/drawingml/2006/main" xmlns:pic="http://schemas.openxmlformats.org/drawingml/2006/picture">
-            <wp:extent cx="5943600" cy="2936347"/>
+            <wp:extent cx="5943600" cy="2940474"/>
             <wp:docPr id="11" name="Picture 11"/>
             <wp:cNvGraphicFramePr>
               <a:graphicFrameLocks noChangeAspect="1"/>
@@ -31254,7 +31254,7 @@
                   <pic:spPr>
                     <a:xfrm>
                       <a:off x="0" y="0"/>
-                      <a:ext cx="5943600" cy="2936347"/>
+                      <a:ext cx="5943600" cy="2940474"/>
                     </a:xfrm>
                     <a:prstGeom prst="rect"/>
                   </pic:spPr>

</xml_diff>